<commit_message>
feat: Mr./Ms. honorific on the Acceptance Form and In-Plant Agreement
profile() exposes intern_honorific from the Personal Info sex (Male ->
Mr., Female -> Ms., unknown -> the combined Mr./Ms. so the sentence stays
intact), and both templates merge it ahead of the intern name. The roster
seeder now keeps the CSV sex column, creating Personal Info rows so
roster-imported interns are addressed correctly from day one — before
that the field was read and discarded. 332 tests passing.
</commit_message>
<xml_diff>
--- a/public/documents/templates/cas/acceptance-form-template.docx
+++ b/public/documents/templates/cas/acceptance-form-template.docx
@@ -79,12 +79,6 @@
         </w:rPr>
         <w:t>${date_today}</w:t>
       </w:r>
-      <w:r>
-        <w:rPr>
-          <w:rFonts w:ascii="Arial" w:hAnsi="Arial" w:cs="Arial"/>
-        </w:rPr>
-        <w:t/>
-      </w:r>
     </w:p>
     <w:p>
       <w:pPr>
@@ -117,7 +111,7 @@
         <w:rPr>
           <w:rFonts w:ascii="Arial" w:hAnsi="Arial" w:cs="Arial"/>
         </w:rPr>
-        <w:t xml:space="preserve">This is to certify that </w:t>
+        <w:t xml:space="preserve">This is to certify that ${intern_honorific} ${intern_name_formal}</w:t>
       </w:r>
       <w:r>
         <w:rPr>
@@ -125,7 +119,73 @@
           <w:b/>
           <w:bCs/>
         </w:rPr>
-        <w:t>Mr. ${intern_name_formal}</w:t>
+        <w:t/>
+      </w:r>
+      <w:r>
+        <w:rPr>
+          <w:rFonts w:ascii="Arial" w:hAnsi="Arial" w:cs="Arial"/>
+        </w:rPr>
+        <w:t>,</w:t>
+      </w:r>
+      <w:r>
+        <w:rPr>
+          <w:rFonts w:ascii="Arial" w:hAnsi="Arial" w:cs="Arial"/>
+        </w:rPr>
+        <w:t xml:space="preserve"> a</w:t>
+      </w:r>
+      <w:r>
+        <w:rPr>
+          <w:rFonts w:ascii="Arial" w:hAnsi="Arial" w:cs="Arial"/>
+        </w:rPr>
+        <w:t xml:space="preserve"> ${year_level_word}-Year ${course_name}</w:t>
+      </w:r>
+      <w:r>
+        <w:rPr>
+          <w:rFonts w:ascii="Arial" w:hAnsi="Arial" w:cs="Arial"/>
+        </w:rPr>
+        <w:t xml:space="preserve"> </w:t>
+      </w:r>
+      <w:r>
+        <w:rPr>
+          <w:rFonts w:ascii="Arial" w:hAnsi="Arial" w:cs="Arial"/>
+        </w:rPr>
+        <w:t>student in the ${college_name}</w:t>
+      </w:r>
+      <w:r>
+        <w:rPr>
+          <w:rFonts w:ascii="Arial" w:hAnsi="Arial" w:cs="Arial"/>
+        </w:rPr>
+        <w:t xml:space="preserve"> – Negros Oriental State University</w:t>
+      </w:r>
+      <w:r>
+        <w:rPr>
+          <w:rFonts w:ascii="Arial" w:hAnsi="Arial" w:cs="Arial"/>
+        </w:rPr>
+        <w:t>–</w:t>
+      </w:r>
+      <w:r>
+        <w:rPr>
+          <w:rFonts w:ascii="Arial" w:hAnsi="Arial" w:cs="Arial"/>
+        </w:rPr>
+        <w:t xml:space="preserve">Bayawan-Sta. Catalina </w:t>
+      </w:r>
+      <w:r>
+        <w:rPr>
+          <w:rFonts w:ascii="Arial" w:hAnsi="Arial" w:cs="Arial"/>
+        </w:rPr>
+        <w:t xml:space="preserve">campus </w:t>
+      </w:r>
+      <w:r>
+        <w:rPr>
+          <w:rFonts w:ascii="Arial" w:hAnsi="Arial" w:cs="Arial"/>
+        </w:rPr>
+        <w:t>–</w:t>
+      </w:r>
+      <w:r>
+        <w:rPr>
+          <w:rFonts w:ascii="Arial" w:hAnsi="Arial" w:cs="Arial"/>
+        </w:rPr>
+        <w:t xml:space="preserve">has been officially </w:t>
       </w:r>
       <w:r>
         <w:rPr>
@@ -133,43 +193,13 @@
           <w:b/>
           <w:bCs/>
         </w:rPr>
-        <w:t/>
-      </w:r>
-      <w:r>
-        <w:rPr>
-          <w:rFonts w:ascii="Arial" w:hAnsi="Arial" w:cs="Arial"/>
-        </w:rPr>
-        <w:t>,</w:t>
-      </w:r>
-      <w:r>
-        <w:rPr>
-          <w:rFonts w:ascii="Arial" w:hAnsi="Arial" w:cs="Arial"/>
-        </w:rPr>
-        <w:t xml:space="preserve"> a</w:t>
-      </w:r>
-      <w:r>
-        <w:rPr>
-          <w:rFonts w:ascii="Arial" w:hAnsi="Arial" w:cs="Arial"/>
-        </w:rPr>
-        <w:t xml:space="preserve"> ${year_level_word}-Year ${course_name}</w:t>
-      </w:r>
-      <w:r>
-        <w:rPr>
-          <w:rFonts w:ascii="Arial" w:hAnsi="Arial" w:cs="Arial"/>
-        </w:rPr>
-        <w:t/>
-      </w:r>
-      <w:r>
-        <w:rPr>
-          <w:rFonts w:ascii="Arial" w:hAnsi="Arial" w:cs="Arial"/>
-        </w:rPr>
-        <w:t xml:space="preserve"/>
-      </w:r>
-      <w:r>
-        <w:rPr>
-          <w:rFonts w:ascii="Arial" w:hAnsi="Arial" w:cs="Arial"/>
-        </w:rPr>
-        <w:t/>
+        <w:t>ACCEPTED AS OJT TRAINEE</w:t>
+      </w:r>
+      <w:r>
+        <w:rPr>
+          <w:rFonts w:ascii="Arial" w:hAnsi="Arial" w:cs="Arial"/>
+        </w:rPr>
+        <w:t xml:space="preserve"> in ${company_name}, which is located at ${company_address}</w:t>
       </w:r>
       <w:r>
         <w:rPr>
@@ -180,141 +210,23 @@
       <w:r>
         <w:rPr>
           <w:rFonts w:ascii="Arial" w:hAnsi="Arial" w:cs="Arial"/>
-        </w:rPr>
-        <w:t>student in the ${college_name}</w:t>
-      </w:r>
-      <w:r>
-        <w:rPr>
-          <w:rFonts w:ascii="Arial" w:hAnsi="Arial" w:cs="Arial"/>
-        </w:rPr>
-        <w:t xml:space="preserve"> – Negros Oriental State University</w:t>
-      </w:r>
-      <w:r>
-        <w:rPr>
-          <w:rFonts w:ascii="Arial" w:hAnsi="Arial" w:cs="Arial"/>
+          <w:u w:val="single"/>
+        </w:rPr>
+        <w:t>Negros Oriental State University</w:t>
+      </w:r>
+      <w:r>
+        <w:rPr>
+          <w:rFonts w:ascii="Arial" w:hAnsi="Arial" w:cs="Arial"/>
+          <w:u w:val="single"/>
         </w:rPr>
         <w:t>–</w:t>
       </w:r>
-      <w:proofErr w:type="spellStart"/>
-      <w:r>
-        <w:rPr>
-          <w:rFonts w:ascii="Arial" w:hAnsi="Arial" w:cs="Arial"/>
-        </w:rPr>
-        <w:t>Bayawan</w:t>
-      </w:r>
-      <w:proofErr w:type="spellEnd"/>
-      <w:r>
-        <w:rPr>
-          <w:rFonts w:ascii="Arial" w:hAnsi="Arial" w:cs="Arial"/>
-        </w:rPr>
-        <w:t xml:space="preserve">-Sta. Catalina </w:t>
-      </w:r>
-      <w:r>
-        <w:rPr>
-          <w:rFonts w:ascii="Arial" w:hAnsi="Arial" w:cs="Arial"/>
-        </w:rPr>
-        <w:t xml:space="preserve">campus </w:t>
-      </w:r>
-      <w:r>
-        <w:rPr>
-          <w:rFonts w:ascii="Arial" w:hAnsi="Arial" w:cs="Arial"/>
-        </w:rPr>
-        <w:t>–</w:t>
-      </w:r>
-      <w:r>
-        <w:rPr>
-          <w:rFonts w:ascii="Arial" w:hAnsi="Arial" w:cs="Arial"/>
-        </w:rPr>
-        <w:t xml:space="preserve">has been officially </w:t>
-      </w:r>
-      <w:r>
-        <w:rPr>
-          <w:rFonts w:ascii="Arial" w:hAnsi="Arial" w:cs="Arial"/>
-          <w:b/>
-          <w:bCs/>
-        </w:rPr>
-        <w:t>ACCEPTED AS OJT TRAINEE</w:t>
-      </w:r>
-      <w:r>
-        <w:rPr>
-          <w:rFonts w:ascii="Arial" w:hAnsi="Arial" w:cs="Arial"/>
-        </w:rPr>
-        <w:t xml:space="preserve"> in ${company_name}, which is located at ${company_address}</w:t>
-      </w:r>
-      <w:r>
-        <w:rPr>
-          <w:rFonts w:ascii="Arial" w:hAnsi="Arial" w:cs="Arial"/>
-        </w:rPr>
-        <w:t xml:space="preserve"/>
-      </w:r>
       <w:r>
         <w:rPr>
           <w:rFonts w:ascii="Arial" w:hAnsi="Arial" w:cs="Arial"/>
           <w:u w:val="single"/>
         </w:rPr>
-        <w:t/>
-      </w:r>
-      <w:r>
-        <w:rPr>
-          <w:rFonts w:ascii="Arial" w:hAnsi="Arial" w:cs="Arial"/>
-          <w:u w:val="single"/>
-        </w:rPr>
-        <w:t/>
-      </w:r>
-      <w:r>
-        <w:rPr>
-          <w:rFonts w:ascii="Arial" w:hAnsi="Arial" w:cs="Arial"/>
-          <w:u w:val="single"/>
-        </w:rPr>
-        <w:t xml:space="preserve"/>
-      </w:r>
-      <w:r>
-        <w:rPr>
-          <w:rFonts w:ascii="Arial" w:hAnsi="Arial" w:cs="Arial"/>
-        </w:rPr>
-        <w:t xml:space="preserve"/>
-      </w:r>
-      <w:r>
-        <w:rPr>
-          <w:rFonts w:ascii="Arial" w:hAnsi="Arial" w:cs="Arial"/>
-        </w:rPr>
-        <w:t/>
-      </w:r>
-      <w:r>
-        <w:rPr>
-          <w:rFonts w:ascii="Arial" w:hAnsi="Arial" w:cs="Arial"/>
-        </w:rPr>
-        <w:t xml:space="preserve"> </w:t>
-      </w:r>
-      <w:r>
-        <w:rPr>
-          <w:rFonts w:ascii="Arial" w:hAnsi="Arial" w:cs="Arial"/>
-          <w:u w:val="single"/>
-        </w:rPr>
-        <w:t>Negros Oriental State University</w:t>
-      </w:r>
-      <w:r>
-        <w:rPr>
-          <w:rFonts w:ascii="Arial" w:hAnsi="Arial" w:cs="Arial"/>
-          <w:u w:val="single"/>
-        </w:rPr>
-        <w:t>–</w:t>
-      </w:r>
-      <w:proofErr w:type="spellStart"/>
-      <w:r>
-        <w:rPr>
-          <w:rFonts w:ascii="Arial" w:hAnsi="Arial" w:cs="Arial"/>
-          <w:u w:val="single"/>
-        </w:rPr>
-        <w:t>Bayawan</w:t>
-      </w:r>
-      <w:proofErr w:type="spellEnd"/>
-      <w:r>
-        <w:rPr>
-          <w:rFonts w:ascii="Arial" w:hAnsi="Arial" w:cs="Arial"/>
-          <w:u w:val="single"/>
-        </w:rPr>
-        <w:t>-Sta. Catalina Campus</w:t>
+        <w:t>Bayawan-Sta. Catalina Campus</w:t>
       </w:r>
       <w:r>
         <w:rPr>
@@ -420,18 +332,6 @@
               </w:rPr>
               <w:t>${company_name}</w:t>
             </w:r>
-            <w:r>
-              <w:rPr>
-                <w:rFonts w:ascii="Arial" w:hAnsi="Arial" w:cs="Arial"/>
-              </w:rPr>
-              <w:t xml:space="preserve"/>
-            </w:r>
-            <w:r>
-              <w:rPr>
-                <w:rFonts w:ascii="Arial" w:hAnsi="Arial" w:cs="Arial"/>
-              </w:rPr>
-              <w:t/>
-            </w:r>
           </w:p>
         </w:tc>
       </w:tr>
@@ -470,16 +370,8 @@
               <w:rPr>
                 <w:rFonts w:ascii="Arial" w:hAnsi="Arial" w:cs="Arial"/>
               </w:rPr>
-              <w:t xml:space="preserve">${supervisor_name}</w:t>
-            </w:r>
-            <w:proofErr w:type="spellStart"/>
-            <w:r>
-              <w:rPr>
-                <w:rFonts w:ascii="Arial" w:hAnsi="Arial" w:cs="Arial"/>
-              </w:rPr>
-              <w:t/>
-            </w:r>
-            <w:proofErr w:type="spellEnd"/>
+              <w:t>${supervisor_name}</w:t>
+            </w:r>
           </w:p>
         </w:tc>
       </w:tr>
@@ -544,24 +436,6 @@
               </w:rPr>
               <w:t>________________________</w:t>
             </w:r>
-            <w:r>
-              <w:rPr>
-                <w:rFonts w:ascii="Arial" w:hAnsi="Arial" w:cs="Arial"/>
-              </w:rPr>
-              <w:t/>
-            </w:r>
-            <w:r>
-              <w:rPr>
-                <w:rFonts w:ascii="Arial" w:hAnsi="Arial" w:cs="Arial"/>
-              </w:rPr>
-              <w:t/>
-            </w:r>
-            <w:r>
-              <w:rPr>
-                <w:rFonts w:ascii="Arial" w:hAnsi="Arial" w:cs="Arial"/>
-              </w:rPr>
-              <w:t/>
-            </w:r>
           </w:p>
         </w:tc>
       </w:tr>
@@ -581,7 +455,13 @@
               <w:rPr>
                 <w:rFonts w:ascii="Arial" w:hAnsi="Arial" w:cs="Arial"/>
               </w:rPr>
-              <w:t>Required Number of Hours:${target_hours}</w:t>
+              <w:t>Required Number of Hours</w:t>
+            </w:r>
+            <w:r>
+              <w:rPr>
+                <w:rFonts w:ascii="Arial" w:hAnsi="Arial" w:cs="Arial"/>
+              </w:rPr>
+              <w:t>:</w:t>
             </w:r>
           </w:p>
         </w:tc>
@@ -600,13 +480,7 @@
               <w:rPr>
                 <w:rFonts w:ascii="Arial" w:hAnsi="Arial" w:cs="Arial"/>
               </w:rPr>
-              <w:t/>
-            </w:r>
-            <w:r>
-              <w:rPr>
-                <w:rFonts w:ascii="Arial" w:hAnsi="Arial" w:cs="Arial"/>
-              </w:rPr>
-              <w:t/>
+              <w:t>:${target_hours}</w:t>
             </w:r>
           </w:p>
         </w:tc>
@@ -770,9 +644,8 @@
             <w:r>
               <w:rPr>
                 <w:rFonts w:ascii="Arial" w:hAnsi="Arial" w:cs="Arial"/>
-                <w:u w:val="single"/>
-              </w:rPr>
-              <w:t>MIS, CAMPUS DIRECTOR</w:t>
+              </w:rPr>
+              <w:t>___________________</w:t>
             </w:r>
           </w:p>
           <w:p>
@@ -828,7 +701,7 @@
                 <w:rFonts w:ascii="Arial" w:hAnsi="Arial" w:cs="Arial"/>
                 <w:u w:val="single"/>
               </w:rPr>
-              <w:t>MIS OFFICE</w:t>
+              <w:t>_____________</w:t>
             </w:r>
           </w:p>
           <w:p>
@@ -884,7 +757,7 @@
                 <w:rFonts w:ascii="Arial" w:hAnsi="Arial" w:cs="Arial"/>
                 <w:u w:val="single"/>
               </w:rPr>
-              <w:t>0917-805-3107</w:t>
+              <w:t>________________</w:t>
             </w:r>
           </w:p>
           <w:p>
@@ -957,19 +830,6 @@
               </w:rPr>
               <w:t>_________${intern_name_formal}_________</w:t>
             </w:r>
-            <w:r>
-              <w:rPr>
-                <w:rFonts w:ascii="Arial" w:hAnsi="Arial" w:cs="Arial"/>
-                <w:u w:val="single"/>
-              </w:rPr>
-              <w:t/>
-            </w:r>
-            <w:r>
-              <w:rPr>
-                <w:rFonts w:ascii="Arial" w:hAnsi="Arial" w:cs="Arial"/>
-              </w:rPr>
-              <w:t/>
-            </w:r>
           </w:p>
           <w:p>
             <w:pPr>
@@ -1063,35 +923,6 @@
                 <w:rFonts w:ascii="Arial" w:hAnsi="Arial" w:cs="Arial"/>
               </w:rPr>
               <w:t>_______${parent_name}______</w:t>
-            </w:r>
-            <w:r>
-              <w:rPr>
-                <w:rFonts w:ascii="Arial" w:hAnsi="Arial" w:cs="Arial"/>
-                <w:u w:val="single"/>
-              </w:rPr>
-              <w:t/>
-            </w:r>
-            <w:proofErr w:type="spellStart"/>
-            <w:r>
-              <w:rPr>
-                <w:rFonts w:ascii="Arial" w:hAnsi="Arial" w:cs="Arial"/>
-                <w:u w:val="single"/>
-              </w:rPr>
-              <w:t/>
-            </w:r>
-            <w:r>
-              <w:rPr>
-                <w:rFonts w:ascii="Arial" w:hAnsi="Arial" w:cs="Arial"/>
-                <w:u w:val="single"/>
-              </w:rPr>
-              <w:t/>
-            </w:r>
-            <w:proofErr w:type="spellEnd"/>
-            <w:r>
-              <w:rPr>
-                <w:rFonts w:ascii="Arial" w:hAnsi="Arial" w:cs="Arial"/>
-              </w:rPr>
-              <w:t/>
             </w:r>
           </w:p>
           <w:p>

</xml_diff>